<commit_message>
add second OPD lab
</commit_message>
<xml_diff>
--- a/OPD/lab_2/report.docx
+++ b/OPD/lab_2/report.docx
@@ -5754,7 +5754,6 @@
               <w:jc w:val="center"/>
               <w:rPr>
                 <w:rFonts w:ascii="Arial" w:hAnsi="Arial" w:cs="Arial"/>
-                <w:lang w:val="en-US"/>
               </w:rPr>
             </w:pPr>
             <w:r>
@@ -6811,7 +6810,6 @@
               <w:jc w:val="center"/>
               <w:rPr>
                 <w:rFonts w:ascii="Arial" w:hAnsi="Arial" w:cs="Arial"/>
-                <w:lang w:val="en-US"/>
               </w:rPr>
             </w:pPr>
             <w:r>
@@ -6820,6 +6818,12 @@
                 <w:lang w:val="en-US"/>
               </w:rPr>
               <w:t>A03D</w:t>
+            </w:r>
+            <w:r>
+              <w:rPr>
+                <w:rFonts w:ascii="Arial" w:hAnsi="Arial" w:cs="Arial"/>
+              </w:rPr>
+              <w:tab/>
             </w:r>
           </w:p>
         </w:tc>
@@ -8883,6 +8887,7 @@
                 <w:rFonts w:ascii="Arial" w:hAnsi="Arial" w:cs="Arial"/>
                 <w:lang w:val="en-US"/>
               </w:rPr>
+              <w:lastRenderedPageBreak/>
               <w:t>03</w:t>
             </w:r>
             <w:r>
@@ -8993,7 +8998,6 @@
                 <w:rFonts w:ascii="Arial" w:hAnsi="Arial" w:cs="Arial"/>
                 <w:lang w:val="en-US"/>
               </w:rPr>
-              <w:lastRenderedPageBreak/>
               <w:t>03</w:t>
             </w:r>
             <w:r>

</xml_diff>